<commit_message>
feat: add bibliography section to Word report
</commit_message>
<xml_diff>
--- a/Informe_Kasha_Tambor_Wayuu.docx
+++ b/Informe_Kasha_Tambor_Wayuu.docx
@@ -2861,6 +2861,277 @@
         <w:t>10. El proyecto demuestra cómo la tecnología digital puede contribuir a la preservación y difusión del patrimonio cultural, conectando a los visitantes con la riqueza cultural del pueblo Wayuu.</w:t>
       </w:r>
     </w:p>
+    <w:p>
+      <w:pPr>
+        <w:pStyle w:val="Heading1"/>
+      </w:pPr>
+      <w:r>
+        <w:rPr>
+          <w:color w:val="C2410C"/>
+        </w:rPr>
+        <w:t>15. Bibliografía</w:t>
+      </w:r>
+    </w:p>
+    <w:p>
+      <w:pPr>
+        <w:spacing w:after="80"/>
+      </w:pPr>
+      <w:r>
+        <w:rPr>
+          <w:b w:val="0"/>
+          <w:i w:val="0"/>
+          <w:sz w:val="20"/>
+        </w:rPr>
+        <w:t>[1] Alcaldía Distrital de Riohacha. (2024). "Monumentos de Riohacha: Guía Turística." Recuperado de https://www.riohacha-laguajira.gov.co/</w:t>
+      </w:r>
+    </w:p>
+    <w:p>
+      <w:pPr>
+        <w:spacing w:after="80"/>
+      </w:pPr>
+      <w:r>
+        <w:rPr>
+          <w:b w:val="0"/>
+          <w:i w:val="0"/>
+          <w:sz w:val="20"/>
+        </w:rPr>
+        <w:t>[2] Panorama Cultural. (2023). "Tres grandes monumentos de Riohacha." Recuperado de https://panoramacultural.com.co/turismo/6766/tres-grandes-monumentos-de-riohacha</w:t>
+      </w:r>
+    </w:p>
+    <w:p>
+      <w:pPr>
+        <w:spacing w:after="80"/>
+      </w:pPr>
+      <w:r>
+        <w:rPr>
+          <w:b w:val="0"/>
+          <w:i w:val="0"/>
+          <w:sz w:val="20"/>
+        </w:rPr>
+        <w:t>[3] Riohacha Travel. (2024). "Monumentos en Riohacha, Colombia." Recuperado de https://www.riohacha.travel/colombia/elcaribe/riohacha/atracciones/8211-monumentos</w:t>
+      </w:r>
+    </w:p>
+    <w:p>
+      <w:pPr>
+        <w:spacing w:after="80"/>
+      </w:pPr>
+      <w:r>
+        <w:rPr>
+          <w:b w:val="0"/>
+          <w:i w:val="0"/>
+          <w:sz w:val="20"/>
+        </w:rPr>
+        <w:t>[4] Colombia Travel. (2025). "Discover Riohacha." ProColombia. Recuperado de https://colombia.travel/en/riohacha</w:t>
+      </w:r>
+    </w:p>
+    <w:p>
+      <w:pPr>
+        <w:spacing w:after="80"/>
+      </w:pPr>
+      <w:r>
+        <w:rPr>
+          <w:b w:val="0"/>
+          <w:i w:val="0"/>
+          <w:sz w:val="20"/>
+        </w:rPr>
+        <w:t>[5] Ministerio de Cultura de Colombia. (2014). "Caracterización del pueblo Wayuu." Dirección de Poblaciones. Bogotá D.C., Colombia.</w:t>
+      </w:r>
+    </w:p>
+    <w:p>
+      <w:pPr>
+        <w:spacing w:after="80"/>
+      </w:pPr>
+      <w:r>
+        <w:rPr>
+          <w:b w:val="0"/>
+          <w:i w:val="0"/>
+          <w:sz w:val="20"/>
+        </w:rPr>
+        <w:t>[6] Jaramillo, S. &amp; Gómez, M. (2019). "La etnia Wayuu: historia, cultura y tradiciones." Revista de Estudios Caribeños, 15(2), 45-67.</w:t>
+      </w:r>
+    </w:p>
+    <w:p>
+      <w:pPr>
+        <w:spacing w:after="80"/>
+      </w:pPr>
+      <w:r>
+        <w:rPr>
+          <w:b w:val="0"/>
+          <w:i w:val="0"/>
+          <w:sz w:val="20"/>
+        </w:rPr>
+        <w:t>[7] Pugh, D. &amp; Pugh, M. (2021). "Wayuu: tejedores de cultura." Editorial Universidad de La Guajira. Riohacha, Colombia.</w:t>
+      </w:r>
+    </w:p>
+    <w:p>
+      <w:pPr>
+        <w:spacing w:after="80"/>
+      </w:pPr>
+      <w:r>
+        <w:rPr>
+          <w:b w:val="0"/>
+          <w:i w:val="0"/>
+          <w:sz w:val="20"/>
+        </w:rPr>
+        <w:t>[8] Spring Boot Reference Documentation. (2024). "Spring Boot 3.2.5 Reference Guide." VMware. Recuperado de https://docs.spring.io/spring-boot/docs/3.2.5/reference/html/</w:t>
+      </w:r>
+    </w:p>
+    <w:p>
+      <w:pPr>
+        <w:spacing w:after="80"/>
+      </w:pPr>
+      <w:r>
+        <w:rPr>
+          <w:b w:val="0"/>
+          <w:i w:val="0"/>
+          <w:sz w:val="20"/>
+        </w:rPr>
+        <w:t>[9] Thymeleaf Project. (2024). "Thymeleaf 3.1 Documentation." Recuperado de https://www.thymeleaf.org/documentation.html</w:t>
+      </w:r>
+    </w:p>
+    <w:p>
+      <w:pPr>
+        <w:spacing w:after="80"/>
+      </w:pPr>
+      <w:r>
+        <w:rPr>
+          <w:b w:val="0"/>
+          <w:i w:val="0"/>
+          <w:sz w:val="20"/>
+        </w:rPr>
+        <w:t>[10] H2 Database Engine. (2024). "H2 Database Manual." Recuperado de https://www.h2database.com/html/main.html</w:t>
+      </w:r>
+    </w:p>
+    <w:p>
+      <w:pPr>
+        <w:spacing w:after="80"/>
+      </w:pPr>
+      <w:r>
+        <w:rPr>
+          <w:b w:val="0"/>
+          <w:i w:val="0"/>
+          <w:sz w:val="20"/>
+        </w:rPr>
+        <w:t>[11] Chart.js Documentation. (2024). "Chart.js 4.4.1 API Reference." Recuperado de https://www.chartjs.org/docs/4.4.1/</w:t>
+      </w:r>
+    </w:p>
+    <w:p>
+      <w:pPr>
+        <w:spacing w:after="80"/>
+      </w:pPr>
+      <w:r>
+        <w:rPr>
+          <w:b w:val="0"/>
+          <w:i w:val="0"/>
+          <w:sz w:val="20"/>
+        </w:rPr>
+        <w:t>[12] ZXing Project. (2024). "ZXing 3.5.3: Multi-format 1D/2D barcode image processing library." Recuperado de https://github.com/zxing/zxing</w:t>
+      </w:r>
+    </w:p>
+    <w:p>
+      <w:pPr>
+        <w:spacing w:after="80"/>
+      </w:pPr>
+      <w:r>
+        <w:rPr>
+          <w:b w:val="0"/>
+          <w:i w:val="0"/>
+          <w:sz w:val="20"/>
+        </w:rPr>
+        <w:t>[13] Bootstrap Team. (2024). "Bootstrap 5.3 Documentation." Recuperado de https://getbootstrap.com/docs/5.3/</w:t>
+      </w:r>
+    </w:p>
+    <w:p>
+      <w:pPr>
+        <w:spacing w:after="80"/>
+      </w:pPr>
+      <w:r>
+        <w:rPr>
+          <w:b w:val="0"/>
+          <w:i w:val="0"/>
+          <w:sz w:val="20"/>
+        </w:rPr>
+        <w:t>[14] Railway.app. (2025). "Railway Documentation: Deploy and manage applications." Recuperado de https://docs.railway.app/</w:t>
+      </w:r>
+    </w:p>
+    <w:p>
+      <w:pPr>
+        <w:spacing w:after="80"/>
+      </w:pPr>
+      <w:r>
+        <w:rPr>
+          <w:b w:val="0"/>
+          <w:i w:val="0"/>
+          <w:sz w:val="20"/>
+        </w:rPr>
+        <w:t>[15] Nixpacks. (2025). "Nixpacks: App source to OCI images." Recuperado de https://nixpacks.com/docs/</w:t>
+      </w:r>
+    </w:p>
+    <w:p>
+      <w:pPr>
+        <w:spacing w:after="80"/>
+      </w:pPr>
+      <w:r>
+        <w:rPr>
+          <w:b w:val="0"/>
+          <w:i w:val="0"/>
+          <w:sz w:val="20"/>
+        </w:rPr>
+        <w:t>[16] Oracle Corporation. (2024). "Java 17 Language Specifications." Recuperado de https://docs.oracle.com/en/java/javase/17/</w:t>
+      </w:r>
+    </w:p>
+    <w:p>
+      <w:pPr>
+        <w:spacing w:after="80"/>
+      </w:pPr>
+      <w:r>
+        <w:rPr>
+          <w:b w:val="0"/>
+          <w:i w:val="0"/>
+          <w:sz w:val="20"/>
+        </w:rPr>
+        <w:t>[17] Maven Project. (2024). "Maven 3.9 Documentation." Recuperado de https://maven.apache.org/guides/</w:t>
+      </w:r>
+    </w:p>
+    <w:p>
+      <w:pPr>
+        <w:spacing w:after="80"/>
+      </w:pPr>
+      <w:r>
+        <w:rPr>
+          <w:b w:val="0"/>
+          <w:i w:val="0"/>
+          <w:sz w:val="20"/>
+        </w:rPr>
+        <w:t>[18] Peña, L. (2020). "Análisis estadístico para ciencias sociales." Editorial Uninorte, Barranquilla, Colombia.</w:t>
+      </w:r>
+    </w:p>
+    <w:p>
+      <w:pPr>
+        <w:spacing w:after="80"/>
+      </w:pPr>
+      <w:r>
+        <w:rPr>
+          <w:b w:val="0"/>
+          <w:i w:val="0"/>
+          <w:sz w:val="20"/>
+        </w:rPr>
+        <w:t>[19] Hernández, R., Fernández, C. &amp; Baptista, P. (2018). "Metodología de la investigación." 7ma ed. McGraw-Hill, México D.F.</w:t>
+      </w:r>
+    </w:p>
+    <w:p>
+      <w:pPr>
+        <w:spacing w:after="80"/>
+      </w:pPr>
+      <w:r>
+        <w:rPr>
+          <w:b w:val="0"/>
+          <w:i w:val="0"/>
+          <w:sz w:val="20"/>
+        </w:rPr>
+        <w:t>[20] Google Maps Platform. (2025). "Coordenadas del monumento Ka'sha - Tambor Wayuu, Riohacha." 11.5444° N, 72.9072° O. Recuperado de https://www.google.com/maps/@11.5444,-72.9072,18z</w:t>
+      </w:r>
+    </w:p>
     <w:sectPr>
       <w:pgSz w:w="12240" w:h="15840"/>
       <w:pgMar w:top="1417" w:right="1701" w:bottom="1417" w:left="1701" w:header="720" w:footer="720" w:gutter="0"/>

</xml_diff>